<commit_message>
Rewrite guest post: remove Sadia, fix AI patterns, trim to 1300 words
- Removed Sadia coaching persona (not relevant for guest post)
- Tightened all sections to stay within 1200-1300 word range
- Trimmed FAQ answers and common mistakes section
- Regenerated Word document with updated content

Co-Authored-By: Claude Opus 4.6 <noreply@anthropic.com>
Claude-Session: https://claude.ai/code/session_016wWKZgLHE66yZfmHwJ5Rgb
</commit_message>
<xml_diff>
--- a/The-Rep-Range-Mistake-Keeping-Beginners-Stuck.docx
+++ b/The-Rep-Range-Mistake-Keeping-Beginners-Stuck.docx
@@ -5,7 +5,7 @@
     <w:p>
       <w:pPr>
         <w:pStyle w:val="Heading1"/>
-        <w:spacing w:after="80"/>
+        <w:spacing w:after="80" w:before="0"/>
       </w:pPr>
       <w:r>
         <w:rPr>
@@ -21,7 +21,7 @@
     </w:p>
     <w:p>
       <w:pPr>
-        <w:spacing w:after="60"/>
+        <w:spacing w:after="60" w:before="0"/>
       </w:pPr>
       <w:r>
         <w:rPr>
@@ -32,7 +32,7 @@
           <w:sz w:val="20"/>
           <w:szCs w:val="20"/>
         </w:rPr>
-        <w:t xml:space="preserve">Title (under 60 chars): </w:t>
+        <w:t xml:space="preserve">Title: </w:t>
       </w:r>
       <w:r>
         <w:rPr>
@@ -41,12 +41,12 @@
           <w:sz w:val="20"/>
           <w:szCs w:val="20"/>
         </w:rPr>
-        <w:t xml:space="preserve">The Rep Range Mistake Keeping Beginners Stuck</w:t>
-      </w:r>
-    </w:p>
-    <w:p>
-      <w:pPr>
-        <w:spacing w:after="60"/>
+        <w:t xml:space="preserve">The Rep Range Mistake Keeping Beginners Stuck (46 chars)</w:t>
+      </w:r>
+    </w:p>
+    <w:p>
+      <w:pPr>
+        <w:spacing w:after="60" w:before="0"/>
       </w:pPr>
       <w:r>
         <w:rPr>
@@ -66,12 +66,12 @@
           <w:sz w:val="20"/>
           <w:szCs w:val="20"/>
         </w:rPr>
-        <w:t xml:space="preserve">Beginners default to 3x10 for every exercise. Learn why matching your rep range to your goal is the fastest fix for stalled progress.</w:t>
-      </w:r>
-    </w:p>
-    <w:p>
-      <w:pPr>
-        <w:spacing w:after="300"/>
+        <w:t xml:space="preserve">Beginners default to 3x10 for every exercise. Learn why matching your rep range to your goal is the fastest fix for stalled progress. (134 chars)</w:t>
+      </w:r>
+    </w:p>
+    <w:p>
+      <w:pPr>
+        <w:spacing w:after="300" w:before="0"/>
       </w:pPr>
       <w:r>
         <w:rPr>
@@ -96,7 +96,7 @@
     </w:p>
     <w:p>
       <w:pPr>
-        <w:spacing w:after="200"/>
+        <w:spacing w:after="200" w:before="0"/>
       </w:pPr>
       <w:r>
         <w:rPr>
@@ -116,21 +116,21 @@
           <w:sz w:val="22"/>
           <w:szCs w:val="22"/>
         </w:rPr>
-        <w:t xml:space="preserve">Beginners default to 3 sets of 10 for everything — without checking whether that rep range matches their actual goal. Strength, muscle growth, and endurance each require a different rep range. Training in the wrong one is the most common reason progress stalls early.</w:t>
-      </w:r>
-    </w:p>
-    <w:p>
-      <w:pPr>
-        <w:spacing w:after="160" w:before="0"/>
-      </w:pPr>
-      <w:r>
-        <w:rPr>
-          <w:rFonts w:ascii="Calibri" w:cs="Calibri" w:eastAsia="Calibri" w:hAnsi="Calibri"/>
-          <w:color w:val="333333"/>
-          <w:sz w:val="22"/>
-          <w:szCs w:val="22"/>
-        </w:rPr>
-        <w:t xml:space="preserve">Walk into any commercial gym and watch the beginners. Most of them are doing the same thing: 3 sets of 10 on every exercise, same weight they used last week, same pace, same results. They're consistent. They're showing up. But nothing is changing — and they can't figure out why.</w:t>
+        <w:t xml:space="preserve">Most beginners pick 3 sets of 10 for every exercise without thinking about it. But rep ranges aren’t random — 1–5 builds strength, 6–12 builds muscle, 12–20 builds endurance. Using the wrong range for your goal is the single biggest reason beginners stop making progress.</w:t>
+      </w:r>
+    </w:p>
+    <w:p>
+      <w:pPr>
+        <w:spacing w:after="160" w:before="0"/>
+      </w:pPr>
+      <w:r>
+        <w:rPr>
+          <w:rFonts w:ascii="Calibri" w:cs="Calibri" w:eastAsia="Calibri" w:hAnsi="Calibri"/>
+          <w:color w:val="333333"/>
+          <w:sz w:val="22"/>
+          <w:szCs w:val="22"/>
+        </w:rPr>
+        <w:t xml:space="preserve">Walk into any gym and you’ll see it. Beginners doing 3 sets of 10 on everything — curls, leg press, lat pulldown. Ask them why, and most can’t answer. They saw it somewhere, someone told them, so they kept doing it.</w:t>
       </w:r>
     </w:p>
     <w:p>
@@ -144,7 +144,7 @@
           <w:sz w:val="22"/>
           <w:szCs w:val="22"/>
         </w:rPr>
-        <w:t xml:space="preserve">The answer is usually not effort, genetics, or supplements. It's the rep range.</w:t>
+        <w:t xml:space="preserve">3x10 isn’t the problem. Using it without knowing what it does — and what it doesn’t — is.</w:t>
       </w:r>
     </w:p>
     <w:p>
@@ -161,49 +161,63 @@
           <w:sz w:val="28"/>
           <w:szCs w:val="28"/>
         </w:rPr>
-        <w:t xml:space="preserve">Why 3x10 Becomes a Trap</w:t>
-      </w:r>
-    </w:p>
-    <w:p>
-      <w:pPr>
-        <w:spacing w:after="160" w:before="0"/>
-      </w:pPr>
-      <w:r>
-        <w:rPr>
-          <w:rFonts w:ascii="Calibri" w:cs="Calibri" w:eastAsia="Calibri" w:hAnsi="Calibri"/>
-          <w:color w:val="333333"/>
-          <w:sz w:val="22"/>
-          <w:szCs w:val="22"/>
-        </w:rPr>
-        <w:t xml:space="preserve">3x10 isn't bad. It falls within the hypertrophy range and works fine for building muscle — when applied correctly. The trap is using it by default, without knowing why you picked it.</w:t>
-      </w:r>
-    </w:p>
-    <w:p>
-      <w:pPr>
-        <w:spacing w:after="160" w:before="0"/>
-      </w:pPr>
-      <w:r>
-        <w:rPr>
-          <w:rFonts w:ascii="Calibri" w:cs="Calibri" w:eastAsia="Calibri" w:hAnsi="Calibri"/>
-          <w:color w:val="333333"/>
-          <w:sz w:val="22"/>
-          <w:szCs w:val="22"/>
-        </w:rPr>
-        <w:t xml:space="preserve">A guy wants to get stronger on bench press, so he does 3 sets of 10 at 135 pounds every Monday. He finishes each set with 3–4 reps still in the tank. That load and rep count isn't heavy enough to force a strength adaptation. His nervous system never gets the signal to recruit more motor units because the demand isn't there.</w:t>
-      </w:r>
-    </w:p>
-    <w:p>
-      <w:pPr>
-        <w:spacing w:after="160" w:before="0"/>
-      </w:pPr>
-      <w:r>
-        <w:rPr>
-          <w:rFonts w:ascii="Calibri" w:cs="Calibri" w:eastAsia="Calibri" w:hAnsi="Calibri"/>
-          <w:color w:val="333333"/>
-          <w:sz w:val="22"/>
-          <w:szCs w:val="22"/>
-        </w:rPr>
-        <w:t xml:space="preserve">A woman wants to build her glutes, so she does 3 sets of 10 bodyweight hip thrusts. She could do 25 in a row without stopping. At that intensity, the set ends long before the muscle reaches the mechanical tension needed for growth. She's training endurance, not hypertrophy — without realizing it.</w:t>
+        <w:t xml:space="preserve">Why 3x10 Feels Right but Often Isn’t</w:t>
+      </w:r>
+    </w:p>
+    <w:p>
+      <w:pPr>
+        <w:spacing w:after="160" w:before="0"/>
+      </w:pPr>
+      <w:r>
+        <w:rPr>
+          <w:rFonts w:ascii="Calibri" w:cs="Calibri" w:eastAsia="Calibri" w:hAnsi="Calibri"/>
+          <w:color w:val="333333"/>
+          <w:sz w:val="22"/>
+          <w:szCs w:val="22"/>
+        </w:rPr>
+        <w:t xml:space="preserve">3x10 sits inside the hypertrophy range. For muscle growth, it works — but only when the weight is heavy enough that those last 2 reps actually challenge you. Most beginners pick a weight they can handle comfortably for all 10 reps, finish the set without much struggle, and move on.</w:t>
+      </w:r>
+    </w:p>
+    <w:p>
+      <w:pPr>
+        <w:spacing w:after="160" w:before="0"/>
+      </w:pPr>
+      <w:r>
+        <w:rPr>
+          <w:rFonts w:ascii="Calibri" w:cs="Calibri" w:eastAsia="Calibri" w:hAnsi="Calibri"/>
+          <w:color w:val="333333"/>
+          <w:sz w:val="22"/>
+          <w:szCs w:val="22"/>
+        </w:rPr>
+        <w:t xml:space="preserve">That’s where the trap starts.</w:t>
+      </w:r>
+    </w:p>
+    <w:p>
+      <w:pPr>
+        <w:spacing w:after="160" w:before="0"/>
+      </w:pPr>
+      <w:r>
+        <w:rPr>
+          <w:rFonts w:ascii="Calibri" w:cs="Calibri" w:eastAsia="Calibri" w:hAnsi="Calibri"/>
+          <w:color w:val="333333"/>
+          <w:sz w:val="22"/>
+          <w:szCs w:val="22"/>
+        </w:rPr>
+        <w:t xml:space="preserve">Take a common example. Someone wants bigger arms. They grab 10kg dumbbells and curl them for 3 sets of 10. They finish every set clean, rest for 30 seconds, and repeat. The set never gets hard. The muscle never gets pushed close to failure. After six weeks, their arms look exactly the same.</w:t>
+      </w:r>
+    </w:p>
+    <w:p>
+      <w:pPr>
+        <w:spacing w:after="160" w:before="0"/>
+      </w:pPr>
+      <w:r>
+        <w:rPr>
+          <w:rFonts w:ascii="Calibri" w:cs="Calibri" w:eastAsia="Calibri" w:hAnsi="Calibri"/>
+          <w:color w:val="333333"/>
+          <w:sz w:val="22"/>
+          <w:szCs w:val="22"/>
+        </w:rPr>
+        <w:t xml:space="preserve">Now look at someone else. Same goal — bigger arms. They grab 14kg dumbbells. Set one, they get 10 reps but rep 9 and 10 are slow and shaky. Set two, they get 9. Set three, they grind out 8. That person’s biceps are getting a growth signal. The first person’s aren’t.</w:t>
       </w:r>
     </w:p>
     <w:p>
@@ -217,7 +231,7 @@
           <w:sz w:val="22"/>
           <w:szCs w:val="22"/>
         </w:rPr>
-        <w:t xml:space="preserve">Same prescription. Two different goals. Neither one is being served.</w:t>
+        <w:t xml:space="preserve">Same exercise. Same rep target. Completely different outcome — because one person matched the load to the rep range, and the other didn’t.</w:t>
       </w:r>
     </w:p>
     <w:p>
@@ -234,21 +248,21 @@
           <w:sz w:val="28"/>
           <w:szCs w:val="28"/>
         </w:rPr>
-        <w:t xml:space="preserve">What Each Rep Range Actually Does to Your Muscles</w:t>
-      </w:r>
-    </w:p>
-    <w:p>
-      <w:pPr>
-        <w:spacing w:after="160" w:before="0"/>
-      </w:pPr>
-      <w:r>
-        <w:rPr>
-          <w:rFonts w:ascii="Calibri" w:cs="Calibri" w:eastAsia="Calibri" w:hAnsi="Calibri"/>
-          <w:color w:val="333333"/>
-          <w:sz w:val="22"/>
-          <w:szCs w:val="22"/>
-        </w:rPr>
-        <w:t xml:space="preserve">Your body doesn't know what exercise you're doing. It only knows how much tension the muscle is under and for how long. That tension-to-duration ratio is what rep ranges control.</w:t>
+        <w:t xml:space="preserve">What Each Rep Range Does (and Doesn’t Do)</w:t>
+      </w:r>
+    </w:p>
+    <w:p>
+      <w:pPr>
+        <w:spacing w:after="160" w:before="0"/>
+      </w:pPr>
+      <w:r>
+        <w:rPr>
+          <w:rFonts w:ascii="Calibri" w:cs="Calibri" w:eastAsia="Calibri" w:hAnsi="Calibri"/>
+          <w:color w:val="333333"/>
+          <w:sz w:val="22"/>
+          <w:szCs w:val="22"/>
+        </w:rPr>
+        <w:t xml:space="preserve">Your muscles don’t count reps. They respond to tension — how much force they’re producing, and for how long. That’s what makes rep ranges matter. Each range creates a different type of stress, and your body adapts to that specific stress.</w:t>
       </w:r>
     </w:p>
     <w:tbl>
@@ -321,7 +335,7 @@
                 <w:sz w:val="20"/>
                 <w:szCs w:val="20"/>
               </w:rPr>
-              <w:t xml:space="preserve">What Happens Physiologically</w:t>
+              <w:t xml:space="preserve">What Your Body Adapts To</w:t>
             </w:r>
           </w:p>
         </w:tc>
@@ -349,7 +363,7 @@
                 <w:sz w:val="20"/>
                 <w:szCs w:val="20"/>
               </w:rPr>
-              <w:t xml:space="preserve">Who Needs This</w:t>
+              <w:t xml:space="preserve">Practical Use</w:t>
             </w:r>
           </w:p>
         </w:tc>
@@ -401,7 +415,7 @@
                 <w:sz w:val="20"/>
                 <w:szCs w:val="20"/>
               </w:rPr>
-              <w:t xml:space="preserve">High neural drive, maximal motor unit recruitment, minimal metabolic fatigue</w:t>
+              <w:t xml:space="preserve">Maximum force production, neural efficiency</w:t>
             </w:r>
           </w:p>
         </w:tc>
@@ -426,7 +440,7 @@
                 <w:sz w:val="20"/>
                 <w:szCs w:val="20"/>
               </w:rPr>
-              <w:t xml:space="preserve">Someone whose goal is lifting heavier weight</w:t>
+              <w:t xml:space="preserve">Getting stronger on squat, bench, deadlift</w:t>
             </w:r>
           </w:p>
         </w:tc>
@@ -480,7 +494,7 @@
                 <w:sz w:val="20"/>
                 <w:szCs w:val="20"/>
               </w:rPr>
-              <w:t xml:space="preserve">Moderate load with enough time under tension to cause mechanical damage and metabolic stress</w:t>
+              <w:t xml:space="preserve">Mechanical tension + metabolic stress in muscle fibers</w:t>
             </w:r>
           </w:p>
         </w:tc>
@@ -506,7 +520,7 @@
                 <w:sz w:val="20"/>
                 <w:szCs w:val="20"/>
               </w:rPr>
-              <w:t xml:space="preserve">Someone whose goal is visible muscle size</w:t>
+              <w:t xml:space="preserve">Building visible muscle size</w:t>
             </w:r>
           </w:p>
         </w:tc>
@@ -558,7 +572,7 @@
                 <w:sz w:val="20"/>
                 <w:szCs w:val="20"/>
               </w:rPr>
-              <w:t xml:space="preserve">Lower load, extended time under tension, capillary and mitochondrial adaptations</w:t>
+              <w:t xml:space="preserve">Sustained low-intensity effort, capillary density</w:t>
             </w:r>
           </w:p>
         </w:tc>
@@ -583,7 +597,7 @@
                 <w:sz w:val="20"/>
                 <w:szCs w:val="20"/>
               </w:rPr>
-              <w:t xml:space="preserve">Someone whose goal is muscular endurance or work capacity</w:t>
+              <w:t xml:space="preserve">Improving muscular endurance and work capacity</w:t>
             </w:r>
           </w:p>
         </w:tc>
@@ -614,7 +628,7 @@
           <w:sz w:val="22"/>
           <w:szCs w:val="22"/>
         </w:rPr>
-        <w:t xml:space="preserve">A 2017 meta-analysis by Brad Schoenfeld in the </w:t>
+        <w:t xml:space="preserve">Brad Schoenfeld’s 2017 meta-analysis in the </w:t>
       </w:r>
       <w:r>
         <w:rPr>
@@ -634,7 +648,7 @@
           <w:sz w:val="22"/>
           <w:szCs w:val="22"/>
         </w:rPr>
-        <w:t xml:space="preserve"> found that hypertrophy can occur across a wide load spectrum — but the 6–12 rep range with moderate-to-heavy weight consistently produced the most efficient muscle growth results across studies.</w:t>
+        <w:t xml:space="preserve"> confirmed this breakdown. Muscle growth can happen at various loads, but the 6–12 range with a challenging weight produces the most consistent hypertrophy results.</w:t>
       </w:r>
     </w:p>
     <w:p>
@@ -648,294 +662,11 @@
           <w:sz w:val="22"/>
           <w:szCs w:val="22"/>
         </w:rPr>
-        <w:t xml:space="preserve">This matters because your rep range isn't a style preference. It's a physiological instruction to your body. Get the instruction wrong and the body builds the wrong thing — or nothing at all.</w:t>
-      </w:r>
-    </w:p>
-    <w:p>
-      <w:pPr>
-        <w:pStyle w:val="Heading2"/>
-        <w:spacing w:after="160" w:before="360"/>
-      </w:pPr>
-      <w:r>
-        <w:rPr>
-          <w:rFonts w:ascii="Calibri" w:cs="Calibri" w:eastAsia="Calibri" w:hAnsi="Calibri"/>
-          <w:b/>
-          <w:bCs/>
-          <w:color w:val="2c2c2c"/>
-          <w:sz w:val="28"/>
-          <w:szCs w:val="28"/>
-        </w:rPr>
-        <w:t xml:space="preserve">The Mismatch That Stalls Most Beginners</w:t>
-      </w:r>
-    </w:p>
-    <w:p>
-      <w:pPr>
-        <w:spacing w:after="160" w:before="0"/>
-      </w:pPr>
-      <w:r>
-        <w:rPr>
-          <w:rFonts w:ascii="Calibri" w:cs="Calibri" w:eastAsia="Calibri" w:hAnsi="Calibri"/>
-          <w:color w:val="333333"/>
-          <w:sz w:val="22"/>
-          <w:szCs w:val="22"/>
-        </w:rPr>
-        <w:t xml:space="preserve">The most common version: someone says they want to build muscle, then trains with a weight they can handle for 15 clean reps. They feel the burn around rep 10, push through to 15, and assume the burn means growth.</w:t>
-      </w:r>
-    </w:p>
-    <w:p>
-      <w:pPr>
-        <w:spacing w:after="160" w:before="0"/>
-      </w:pPr>
-      <w:r>
-        <w:rPr>
-          <w:rFonts w:ascii="Calibri" w:cs="Calibri" w:eastAsia="Calibri" w:hAnsi="Calibri"/>
-          <w:color w:val="333333"/>
-          <w:sz w:val="22"/>
-          <w:szCs w:val="22"/>
-        </w:rPr>
-        <w:t xml:space="preserve">It doesn't. That burn is metabolic fatigue — hydrogen ion buildup in the muscle. It feels productive but it's not the same as the mechanical tension that drives hypertrophy. The muscle was never under enough load for long enough to trigger the repair-and-grow response.</w:t>
-      </w:r>
-    </w:p>
-    <w:p>
-      <w:pPr>
-        <w:spacing w:after="160" w:before="0"/>
-      </w:pPr>
-      <w:r>
-        <w:rPr>
-          <w:rFonts w:ascii="Calibri" w:cs="Calibri" w:eastAsia="Calibri" w:hAnsi="Calibri"/>
-          <w:color w:val="333333"/>
-          <w:sz w:val="22"/>
-          <w:szCs w:val="22"/>
-        </w:rPr>
-        <w:t xml:space="preserve">Here's what a corrected version looks like for the same person:</w:t>
-      </w:r>
-    </w:p>
-    <w:p>
-      <w:pPr>
-        <w:spacing w:after="160" w:before="0"/>
-      </w:pPr>
-      <w:r>
-        <w:rPr>
-          <w:rFonts w:ascii="Calibri" w:cs="Calibri" w:eastAsia="Calibri" w:hAnsi="Calibri"/>
-          <w:b/>
-          <w:bCs/>
-          <w:color w:val="333333"/>
-          <w:sz w:val="22"/>
-          <w:szCs w:val="22"/>
-        </w:rPr>
-        <w:t xml:space="preserve">Before: </w:t>
-      </w:r>
-      <w:r>
-        <w:rPr>
-          <w:rFonts w:ascii="Calibri" w:cs="Calibri" w:eastAsia="Calibri" w:hAnsi="Calibri"/>
-          <w:color w:val="333333"/>
-          <w:sz w:val="22"/>
-          <w:szCs w:val="22"/>
-        </w:rPr>
-        <w:t xml:space="preserve">Dumbbell shoulder press, 15-pound dumbbells, 3 sets of 15. Finishes each set feeling tired but could keep going.</w:t>
-      </w:r>
-    </w:p>
-    <w:p>
-      <w:pPr>
-        <w:spacing w:after="160" w:before="0"/>
-      </w:pPr>
-      <w:r>
-        <w:rPr>
-          <w:rFonts w:ascii="Calibri" w:cs="Calibri" w:eastAsia="Calibri" w:hAnsi="Calibri"/>
-          <w:b/>
-          <w:bCs/>
-          <w:color w:val="333333"/>
-          <w:sz w:val="22"/>
-          <w:szCs w:val="22"/>
-        </w:rPr>
-        <w:t xml:space="preserve">After: </w:t>
-      </w:r>
-      <w:r>
-        <w:rPr>
-          <w:rFonts w:ascii="Calibri" w:cs="Calibri" w:eastAsia="Calibri" w:hAnsi="Calibri"/>
-          <w:color w:val="333333"/>
-          <w:sz w:val="22"/>
-          <w:szCs w:val="22"/>
-        </w:rPr>
-        <w:t xml:space="preserve">Dumbbell shoulder press, 25-pound dumbbells, 3 sets of 8–10. Rep 8 is hard. Rep 10 requires full effort. That's the hypertrophy zone — the muscle is under real load for enough reps to cause adaptation.</w:t>
-      </w:r>
-    </w:p>
-    <w:p>
-      <w:pPr>
-        <w:spacing w:after="240" w:before="0"/>
-      </w:pPr>
-      <w:r>
-        <w:rPr>
-          <w:rFonts w:ascii="Calibri" w:cs="Calibri" w:eastAsia="Calibri" w:hAnsi="Calibri"/>
-          <w:color w:val="333333"/>
-          <w:sz w:val="22"/>
-          <w:szCs w:val="22"/>
-        </w:rPr>
-        <w:t xml:space="preserve">Same exercise. Same gym session. Completely different stimulus.</w:t>
-      </w:r>
-    </w:p>
-    <w:p>
-      <w:pPr>
-        <w:pStyle w:val="Heading2"/>
-        <w:spacing w:after="160" w:before="360"/>
-      </w:pPr>
-      <w:r>
-        <w:rPr>
-          <w:rFonts w:ascii="Calibri" w:cs="Calibri" w:eastAsia="Calibri" w:hAnsi="Calibri"/>
-          <w:b/>
-          <w:bCs/>
-          <w:color w:val="2c2c2c"/>
-          <w:sz w:val="28"/>
-          <w:szCs w:val="28"/>
-        </w:rPr>
-        <w:t xml:space="preserve">How to Fix It: Goal First, Rep Range Second</w:t>
-      </w:r>
-    </w:p>
-    <w:p>
-      <w:pPr>
-        <w:spacing w:after="160" w:before="0"/>
-      </w:pPr>
-      <w:r>
-        <w:rPr>
-          <w:rFonts w:ascii="Calibri" w:cs="Calibri" w:eastAsia="Calibri" w:hAnsi="Calibri"/>
-          <w:color w:val="333333"/>
-          <w:sz w:val="22"/>
-          <w:szCs w:val="22"/>
-        </w:rPr>
-        <w:t xml:space="preserve">Coach Sadia Mannan uses a one-question filter with every new client before they touch a barbell: </w:t>
-      </w:r>
-      <w:r>
-        <w:rPr>
-          <w:rFonts w:ascii="Calibri" w:cs="Calibri" w:eastAsia="Calibri" w:hAnsi="Calibri"/>
-          <w:i/>
-          <w:iCs/>
-          <w:color w:val="333333"/>
-          <w:sz w:val="22"/>
-          <w:szCs w:val="22"/>
-        </w:rPr>
-        <w:t xml:space="preserve">"What do you actually want — to lift heavier, to look more muscular, or to last longer during sets?"</w:t>
-      </w:r>
-    </w:p>
-    <w:p>
-      <w:pPr>
-        <w:spacing w:after="160" w:before="0"/>
-      </w:pPr>
-      <w:r>
-        <w:rPr>
-          <w:rFonts w:ascii="Calibri" w:cs="Calibri" w:eastAsia="Calibri" w:hAnsi="Calibri"/>
-          <w:color w:val="333333"/>
-          <w:sz w:val="22"/>
-          <w:szCs w:val="22"/>
-        </w:rPr>
-        <w:t xml:space="preserve">The answer dictates everything:</w:t>
-      </w:r>
-    </w:p>
-    <w:p>
-      <w:pPr>
-        <w:spacing w:after="160" w:before="0"/>
-      </w:pPr>
-      <w:r>
-        <w:rPr>
-          <w:rFonts w:ascii="Calibri" w:cs="Calibri" w:eastAsia="Calibri" w:hAnsi="Calibri"/>
-          <w:b/>
-          <w:bCs/>
-          <w:color w:val="333333"/>
-          <w:sz w:val="22"/>
-          <w:szCs w:val="22"/>
-        </w:rPr>
-        <w:t xml:space="preserve">"I want to lift heavier." </w:t>
-      </w:r>
-      <w:r>
-        <w:rPr>
-          <w:rFonts w:ascii="Calibri" w:cs="Calibri" w:eastAsia="Calibri" w:hAnsi="Calibri"/>
-          <w:color w:val="333333"/>
-          <w:sz w:val="22"/>
-          <w:szCs w:val="22"/>
-        </w:rPr>
-        <w:t xml:space="preserve">→ Train in the 3–5 rep range. Pick compound lifts — squat, bench, deadlift, overhead press. Load the bar heavy enough that rep 5 is a genuine grind. Rest 3–5 minutes between sets. Strength is a neural skill — you need full recovery between efforts.</w:t>
-      </w:r>
-    </w:p>
-    <w:p>
-      <w:pPr>
-        <w:spacing w:after="160" w:before="0"/>
-      </w:pPr>
-      <w:r>
-        <w:rPr>
-          <w:rFonts w:ascii="Calibri" w:cs="Calibri" w:eastAsia="Calibri" w:hAnsi="Calibri"/>
-          <w:b/>
-          <w:bCs/>
-          <w:color w:val="333333"/>
-          <w:sz w:val="22"/>
-          <w:szCs w:val="22"/>
-        </w:rPr>
-        <w:t xml:space="preserve">"I want to look more muscular." </w:t>
-      </w:r>
-      <w:r>
-        <w:rPr>
-          <w:rFonts w:ascii="Calibri" w:cs="Calibri" w:eastAsia="Calibri" w:hAnsi="Calibri"/>
-          <w:color w:val="333333"/>
-          <w:sz w:val="22"/>
-          <w:szCs w:val="22"/>
-        </w:rPr>
-        <w:t xml:space="preserve">→ Train in the 8–10 rep range. Use a weight where you hit near-failure by rep 10. Control the eccentric (lowering phase) for 2–3 seconds — that's where most of the muscle damage happens. Rest 60–90 seconds. You want metabolic stress AND mechanical tension together.</w:t>
-      </w:r>
-    </w:p>
-    <w:p>
-      <w:pPr>
-        <w:spacing w:after="160" w:before="0"/>
-      </w:pPr>
-      <w:r>
-        <w:rPr>
-          <w:rFonts w:ascii="Calibri" w:cs="Calibri" w:eastAsia="Calibri" w:hAnsi="Calibri"/>
-          <w:b/>
-          <w:bCs/>
-          <w:color w:val="333333"/>
-          <w:sz w:val="22"/>
-          <w:szCs w:val="22"/>
-        </w:rPr>
-        <w:t xml:space="preserve">"I want to last longer." </w:t>
-      </w:r>
-      <w:r>
-        <w:rPr>
-          <w:rFonts w:ascii="Calibri" w:cs="Calibri" w:eastAsia="Calibri" w:hAnsi="Calibri"/>
-          <w:color w:val="333333"/>
-          <w:sz w:val="22"/>
-          <w:szCs w:val="22"/>
-        </w:rPr>
-        <w:t xml:space="preserve">→ Train in the 15–20 rep range. Lighter load, focus on maintaining form as fatigue accumulates. Rest 30–60 seconds. The goal is teaching your muscles to work under sustained low-level fatigue.</w:t>
-      </w:r>
-    </w:p>
-    <w:p>
-      <w:pPr>
-        <w:spacing w:after="160" w:before="0"/>
-      </w:pPr>
-      <w:r>
-        <w:rPr>
-          <w:rFonts w:ascii="Calibri" w:cs="Calibri" w:eastAsia="Calibri" w:hAnsi="Calibri"/>
-          <w:color w:val="333333"/>
-          <w:sz w:val="22"/>
-          <w:szCs w:val="22"/>
-        </w:rPr>
-        <w:t xml:space="preserve">One question. One answer. The rep range picks itself.</w:t>
-      </w:r>
-    </w:p>
-    <w:p>
-      <w:pPr>
-        <w:spacing w:after="240" w:before="0"/>
-      </w:pPr>
-      <w:r>
-        <w:rPr>
-          <w:rFonts w:ascii="Calibri" w:cs="Calibri" w:eastAsia="Calibri" w:hAnsi="Calibri"/>
-          <w:color w:val="333333"/>
-          <w:sz w:val="22"/>
-          <w:szCs w:val="22"/>
-        </w:rPr>
-        <w:t xml:space="preserve">If </w:t>
-      </w:r>
-      <w:hyperlink w:history="1" r:id="rIdrx1ezbutytlfvohjow9pn">
+        <w:t xml:space="preserve">The rep range is an instruction to your body. The wrong instruction gets the wrong result. If you’re unclear on how </w:t>
+      </w:r>
+      <w:hyperlink w:history="1" r:id="rIdoryly_wyh1kkkmhpifkbq">
         <w:r>
           <w:rPr>
-            <w:rStyle w:val="Hyperlink"/>
             <w:rFonts w:ascii="Calibri" w:cs="Calibri" w:eastAsia="Calibri" w:hAnsi="Calibri"/>
             <w:color w:val="2b6cb0"/>
             <w:sz w:val="22"/>
@@ -952,7 +683,7 @@
           <w:sz w:val="22"/>
           <w:szCs w:val="22"/>
         </w:rPr>
-        <w:t xml:space="preserve"> still feel confusing as concepts, nail that foundation first — it makes every decision after this one simpler.</w:t>
+        <w:t xml:space="preserve"> work together in the first place, sort that out first — everything else builds on it.</w:t>
       </w:r>
     </w:p>
     <w:p>
@@ -969,113 +700,35 @@
           <w:sz w:val="28"/>
           <w:szCs w:val="28"/>
         </w:rPr>
-        <w:t xml:space="preserve">The 3-Week Check</w:t>
-      </w:r>
-    </w:p>
-    <w:p>
-      <w:pPr>
-        <w:spacing w:after="160" w:before="0"/>
-      </w:pPr>
-      <w:r>
-        <w:rPr>
-          <w:rFonts w:ascii="Calibri" w:cs="Calibri" w:eastAsia="Calibri" w:hAnsi="Calibri"/>
-          <w:color w:val="333333"/>
-          <w:sz w:val="22"/>
-          <w:szCs w:val="22"/>
-        </w:rPr>
-        <w:t xml:space="preserve">After adjusting your rep range, give it three weeks before evaluating. Not three days. Your body needs repeated exposure to the new stimulus before it starts adapting.</w:t>
-      </w:r>
-    </w:p>
-    <w:p>
-      <w:pPr>
-        <w:spacing w:after="160" w:before="0"/>
-      </w:pPr>
-      <w:r>
-        <w:rPr>
-          <w:rFonts w:ascii="Calibri" w:cs="Calibri" w:eastAsia="Calibri" w:hAnsi="Calibri"/>
-          <w:color w:val="333333"/>
-          <w:sz w:val="22"/>
-          <w:szCs w:val="22"/>
-        </w:rPr>
-        <w:t xml:space="preserve">What to track:</w:t>
-      </w:r>
-    </w:p>
-    <w:p>
-      <w:pPr>
-        <w:spacing w:after="160" w:before="0"/>
-        <w:ind w:left="360"/>
-      </w:pPr>
-      <w:r>
-        <w:rPr>
-          <w:rFonts w:ascii="Calibri" w:cs="Calibri" w:eastAsia="Calibri" w:hAnsi="Calibri"/>
-          <w:b/>
-          <w:bCs/>
-          <w:color w:val="333333"/>
-          <w:sz w:val="22"/>
-          <w:szCs w:val="22"/>
-        </w:rPr>
-        <w:t xml:space="preserve">For strength: </w:t>
-      </w:r>
-      <w:r>
-        <w:rPr>
-          <w:rFonts w:ascii="Calibri" w:cs="Calibri" w:eastAsia="Calibri" w:hAnsi="Calibri"/>
-          <w:color w:val="333333"/>
-          <w:sz w:val="22"/>
-          <w:szCs w:val="22"/>
-        </w:rPr>
-        <w:t xml:space="preserve">Are you adding 2.5–5 pounds to your main lifts every 1–2 weeks? If yes, the rep range is working.</w:t>
-      </w:r>
-    </w:p>
-    <w:p>
-      <w:pPr>
-        <w:spacing w:after="160" w:before="0"/>
-        <w:ind w:left="360"/>
-      </w:pPr>
-      <w:r>
-        <w:rPr>
-          <w:rFonts w:ascii="Calibri" w:cs="Calibri" w:eastAsia="Calibri" w:hAnsi="Calibri"/>
-          <w:b/>
-          <w:bCs/>
-          <w:color w:val="333333"/>
-          <w:sz w:val="22"/>
-          <w:szCs w:val="22"/>
-        </w:rPr>
-        <w:t xml:space="preserve">For muscle growth: </w:t>
-      </w:r>
-      <w:r>
-        <w:rPr>
-          <w:rFonts w:ascii="Calibri" w:cs="Calibri" w:eastAsia="Calibri" w:hAnsi="Calibri"/>
-          <w:color w:val="333333"/>
-          <w:sz w:val="22"/>
-          <w:szCs w:val="22"/>
-        </w:rPr>
-        <w:t xml:space="preserve">Are the last 2 reps of each set genuinely difficult? Are you having to increase the weight to stay in the 8–10 range? Both are signs the stimulus is hitting.</w:t>
-      </w:r>
-    </w:p>
-    <w:p>
-      <w:pPr>
-        <w:spacing w:after="160" w:before="0"/>
-        <w:ind w:left="360"/>
-      </w:pPr>
-      <w:r>
-        <w:rPr>
-          <w:rFonts w:ascii="Calibri" w:cs="Calibri" w:eastAsia="Calibri" w:hAnsi="Calibri"/>
-          <w:b/>
-          <w:bCs/>
-          <w:color w:val="333333"/>
-          <w:sz w:val="22"/>
-          <w:szCs w:val="22"/>
-        </w:rPr>
-        <w:t xml:space="preserve">For endurance: </w:t>
-      </w:r>
-      <w:r>
-        <w:rPr>
-          <w:rFonts w:ascii="Calibri" w:cs="Calibri" w:eastAsia="Calibri" w:hAnsi="Calibri"/>
-          <w:color w:val="333333"/>
-          <w:sz w:val="22"/>
-          <w:szCs w:val="22"/>
-        </w:rPr>
-        <w:t xml:space="preserve">Can you sustain more reps at the same weight than you could three weeks ago? That's the adaptation showing up.</w:t>
+        <w:t xml:space="preserve">The Mistake Almost Every Beginner Makes</w:t>
+      </w:r>
+    </w:p>
+    <w:p>
+      <w:pPr>
+        <w:spacing w:after="160" w:before="0"/>
+      </w:pPr>
+      <w:r>
+        <w:rPr>
+          <w:rFonts w:ascii="Calibri" w:cs="Calibri" w:eastAsia="Calibri" w:hAnsi="Calibri"/>
+          <w:color w:val="333333"/>
+          <w:sz w:val="22"/>
+          <w:szCs w:val="22"/>
+        </w:rPr>
+        <w:t xml:space="preserve">The most common version looks like this: someone wants to build muscle. They pick a weight that lets them hit 15 reps per set without much trouble. They feel a burn around rep 12, push to 15, and assume the burn means growth.</w:t>
+      </w:r>
+    </w:p>
+    <w:p>
+      <w:pPr>
+        <w:spacing w:after="160" w:before="0"/>
+      </w:pPr>
+      <w:r>
+        <w:rPr>
+          <w:rFonts w:ascii="Calibri" w:cs="Calibri" w:eastAsia="Calibri" w:hAnsi="Calibri"/>
+          <w:color w:val="333333"/>
+          <w:sz w:val="22"/>
+          <w:szCs w:val="22"/>
+        </w:rPr>
+        <w:t xml:space="preserve">It doesn’t. That burning sensation is hydrogen ion buildup — a byproduct of metabolic fatigue. It tells you the muscle is tired, not that it’s growing. Growth comes from mechanical tension — loading the muscle heavy enough that it has to recruit a large number of muscle fibers to handle the demand.</w:t>
       </w:r>
     </w:p>
     <w:p>
@@ -1085,11 +738,22 @@
       <w:r>
         <w:rPr>
           <w:rFonts w:ascii="Calibri" w:cs="Calibri" w:eastAsia="Calibri" w:hAnsi="Calibri"/>
-          <w:color w:val="333333"/>
-          <w:sz w:val="22"/>
-          <w:szCs w:val="22"/>
-        </w:rPr>
-        <w:t xml:space="preserve">If none of these are happening, the weight is wrong — not the rep range. Increase the load until the last 2–3 reps of each set require real effort.</w:t>
+          <w:b/>
+          <w:bCs/>
+          <w:color w:val="333333"/>
+          <w:sz w:val="22"/>
+          <w:szCs w:val="22"/>
+        </w:rPr>
+        <w:t xml:space="preserve">The fix is straightforward. </w:t>
+      </w:r>
+      <w:r>
+        <w:rPr>
+          <w:rFonts w:ascii="Calibri" w:cs="Calibri" w:eastAsia="Calibri" w:hAnsi="Calibri"/>
+          <w:color w:val="333333"/>
+          <w:sz w:val="22"/>
+          <w:szCs w:val="22"/>
+        </w:rPr>
+        <w:t xml:space="preserve">Same exercise, heavier weight, fewer reps. Instead of shoulder pressing 8kg dumbbells for 15 easy reps, load up 14kg and aim for 8–10. If rep 10 is a real fight, you’re in the right range. If you could have done 4 more, go heavier.</w:t>
       </w:r>
     </w:p>
     <w:p>
@@ -1106,6 +770,338 @@
           <w:sz w:val="28"/>
           <w:szCs w:val="28"/>
         </w:rPr>
+        <w:t xml:space="preserve">How to Pick the Right Rep Range for Your Goal</w:t>
+      </w:r>
+    </w:p>
+    <w:p>
+      <w:pPr>
+        <w:spacing w:after="160" w:before="0"/>
+      </w:pPr>
+      <w:r>
+        <w:rPr>
+          <w:rFonts w:ascii="Calibri" w:cs="Calibri" w:eastAsia="Calibri" w:hAnsi="Calibri"/>
+          <w:color w:val="333333"/>
+          <w:sz w:val="22"/>
+          <w:szCs w:val="22"/>
+        </w:rPr>
+        <w:t xml:space="preserve">Forget what you’ve always done. Start with what you actually want.</w:t>
+      </w:r>
+    </w:p>
+    <w:p>
+      <w:pPr>
+        <w:spacing w:after="160" w:before="0"/>
+      </w:pPr>
+      <w:r>
+        <w:rPr>
+          <w:rFonts w:ascii="Calibri" w:cs="Calibri" w:eastAsia="Calibri" w:hAnsi="Calibri"/>
+          <w:b/>
+          <w:bCs/>
+          <w:color w:val="333333"/>
+          <w:sz w:val="22"/>
+          <w:szCs w:val="22"/>
+        </w:rPr>
+        <w:t xml:space="preserve">“I want to lift heavier.” </w:t>
+      </w:r>
+      <w:r>
+        <w:rPr>
+          <w:rFonts w:ascii="Calibri" w:cs="Calibri" w:eastAsia="Calibri" w:hAnsi="Calibri"/>
+          <w:color w:val="333333"/>
+          <w:sz w:val="22"/>
+          <w:szCs w:val="22"/>
+        </w:rPr>
+        <w:t xml:space="preserve">Use 3–5 reps per set. Pick compound movements — squat, bench press, deadlift, overhead press. The weight should be heavy enough that rep 5 takes genuine effort. Rest 3–5 minutes between sets so your nervous system recovers fully. Strength is a skill that requires fresh attempts, not fatigued grinding.</w:t>
+      </w:r>
+    </w:p>
+    <w:p>
+      <w:pPr>
+        <w:spacing w:after="160" w:before="0"/>
+      </w:pPr>
+      <w:r>
+        <w:rPr>
+          <w:rFonts w:ascii="Calibri" w:cs="Calibri" w:eastAsia="Calibri" w:hAnsi="Calibri"/>
+          <w:b/>
+          <w:bCs/>
+          <w:color w:val="333333"/>
+          <w:sz w:val="22"/>
+          <w:szCs w:val="22"/>
+        </w:rPr>
+        <w:t xml:space="preserve">“I want to build muscle.” </w:t>
+      </w:r>
+      <w:r>
+        <w:rPr>
+          <w:rFonts w:ascii="Calibri" w:cs="Calibri" w:eastAsia="Calibri" w:hAnsi="Calibri"/>
+          <w:color w:val="333333"/>
+          <w:sz w:val="22"/>
+          <w:szCs w:val="22"/>
+        </w:rPr>
+        <w:t xml:space="preserve">Use 8–10 reps per set. Choose a weight where rep 8 is difficult and rep 10 is near your limit. Slow down the lowering portion of each rep to 2–3 seconds — that eccentric phase is where most of the muscle damage that triggers growth occurs. Rest 60–90 seconds between sets.</w:t>
+      </w:r>
+    </w:p>
+    <w:p>
+      <w:pPr>
+        <w:spacing w:after="160" w:before="0"/>
+      </w:pPr>
+      <w:r>
+        <w:rPr>
+          <w:rFonts w:ascii="Calibri" w:cs="Calibri" w:eastAsia="Calibri" w:hAnsi="Calibri"/>
+          <w:b/>
+          <w:bCs/>
+          <w:color w:val="333333"/>
+          <w:sz w:val="22"/>
+          <w:szCs w:val="22"/>
+        </w:rPr>
+        <w:t xml:space="preserve">“I want to improve endurance.” </w:t>
+      </w:r>
+      <w:r>
+        <w:rPr>
+          <w:rFonts w:ascii="Calibri" w:cs="Calibri" w:eastAsia="Calibri" w:hAnsi="Calibri"/>
+          <w:color w:val="333333"/>
+          <w:sz w:val="22"/>
+          <w:szCs w:val="22"/>
+        </w:rPr>
+        <w:t xml:space="preserve">Use 15–20 reps per set. Lighter load, but focus on keeping form tight as fatigue builds. Rest 30–60 seconds. The goal is training your muscles to produce force under sustained fatigue.</w:t>
+      </w:r>
+    </w:p>
+    <w:p>
+      <w:pPr>
+        <w:spacing w:after="240" w:before="0"/>
+      </w:pPr>
+      <w:r>
+        <w:rPr>
+          <w:rFonts w:ascii="Calibri" w:cs="Calibri" w:eastAsia="Calibri" w:hAnsi="Calibri"/>
+          <w:color w:val="333333"/>
+          <w:sz w:val="22"/>
+          <w:szCs w:val="22"/>
+        </w:rPr>
+        <w:t xml:space="preserve">One question decides everything: what do you actually want your body to do? Answer that honestly and the rep range follows.</w:t>
+      </w:r>
+    </w:p>
+    <w:p>
+      <w:pPr>
+        <w:pStyle w:val="Heading2"/>
+        <w:spacing w:after="160" w:before="360"/>
+      </w:pPr>
+      <w:r>
+        <w:rPr>
+          <w:rFonts w:ascii="Calibri" w:cs="Calibri" w:eastAsia="Calibri" w:hAnsi="Calibri"/>
+          <w:b/>
+          <w:bCs/>
+          <w:color w:val="2c2c2c"/>
+          <w:sz w:val="28"/>
+          <w:szCs w:val="28"/>
+        </w:rPr>
+        <w:t xml:space="preserve">Common Mistakes After Picking the Right Range</w:t>
+      </w:r>
+    </w:p>
+    <w:p>
+      <w:pPr>
+        <w:spacing w:after="160" w:before="0"/>
+      </w:pPr>
+      <w:r>
+        <w:rPr>
+          <w:rFonts w:ascii="Calibri" w:cs="Calibri" w:eastAsia="Calibri" w:hAnsi="Calibri"/>
+          <w:b/>
+          <w:bCs/>
+          <w:color w:val="333333"/>
+          <w:sz w:val="22"/>
+          <w:szCs w:val="22"/>
+        </w:rPr>
+        <w:t xml:space="preserve">Too light, too comfortable. </w:t>
+      </w:r>
+      <w:r>
+        <w:rPr>
+          <w:rFonts w:ascii="Calibri" w:cs="Calibri" w:eastAsia="Calibri" w:hAnsi="Calibri"/>
+          <w:color w:val="333333"/>
+          <w:sz w:val="22"/>
+          <w:szCs w:val="22"/>
+        </w:rPr>
+        <w:t xml:space="preserve">You’re in the 8–10 range but every set ends with 3–4 reps left in the tank. The range is right, the load is wrong. If rep 10 doesn’t challenge you, add weight.</w:t>
+      </w:r>
+    </w:p>
+    <w:p>
+      <w:pPr>
+        <w:spacing w:after="160" w:before="0"/>
+      </w:pPr>
+      <w:r>
+        <w:rPr>
+          <w:rFonts w:ascii="Calibri" w:cs="Calibri" w:eastAsia="Calibri" w:hAnsi="Calibri"/>
+          <w:b/>
+          <w:bCs/>
+          <w:color w:val="333333"/>
+          <w:sz w:val="22"/>
+          <w:szCs w:val="22"/>
+        </w:rPr>
+        <w:t xml:space="preserve">Switching too often. </w:t>
+      </w:r>
+      <w:r>
+        <w:rPr>
+          <w:rFonts w:ascii="Calibri" w:cs="Calibri" w:eastAsia="Calibri" w:hAnsi="Calibri"/>
+          <w:color w:val="333333"/>
+          <w:sz w:val="22"/>
+          <w:szCs w:val="22"/>
+        </w:rPr>
+        <w:t xml:space="preserve">Strength Monday, hypertrophy Wednesday, endurance Friday — your body needs consistent exposure to one stimulus before it adapts. Stick with one range for at least 6 weeks.</w:t>
+      </w:r>
+    </w:p>
+    <w:p>
+      <w:pPr>
+        <w:spacing w:after="240" w:before="0"/>
+      </w:pPr>
+      <w:r>
+        <w:rPr>
+          <w:rFonts w:ascii="Calibri" w:cs="Calibri" w:eastAsia="Calibri" w:hAnsi="Calibri"/>
+          <w:b/>
+          <w:bCs/>
+          <w:color w:val="333333"/>
+          <w:sz w:val="22"/>
+          <w:szCs w:val="22"/>
+        </w:rPr>
+        <w:t xml:space="preserve">Ignoring progression. </w:t>
+      </w:r>
+      <w:r>
+        <w:rPr>
+          <w:rFonts w:ascii="Calibri" w:cs="Calibri" w:eastAsia="Calibri" w:hAnsi="Calibri"/>
+          <w:color w:val="333333"/>
+          <w:sz w:val="22"/>
+          <w:szCs w:val="22"/>
+        </w:rPr>
+        <w:t xml:space="preserve">Same weight for weeks on end. Once 10 reps feels manageable, bump the weight up by the smallest increment available. That’s how you stay productive instead of coasting.</w:t>
+      </w:r>
+    </w:p>
+    <w:p>
+      <w:pPr>
+        <w:pStyle w:val="Heading2"/>
+        <w:spacing w:after="160" w:before="360"/>
+      </w:pPr>
+      <w:r>
+        <w:rPr>
+          <w:rFonts w:ascii="Calibri" w:cs="Calibri" w:eastAsia="Calibri" w:hAnsi="Calibri"/>
+          <w:b/>
+          <w:bCs/>
+          <w:color w:val="2c2c2c"/>
+          <w:sz w:val="28"/>
+          <w:szCs w:val="28"/>
+        </w:rPr>
+        <w:t xml:space="preserve">How to Know It’s Working</w:t>
+      </w:r>
+    </w:p>
+    <w:p>
+      <w:pPr>
+        <w:spacing w:after="160" w:before="0"/>
+      </w:pPr>
+      <w:r>
+        <w:rPr>
+          <w:rFonts w:ascii="Calibri" w:cs="Calibri" w:eastAsia="Calibri" w:hAnsi="Calibri"/>
+          <w:color w:val="333333"/>
+          <w:sz w:val="22"/>
+          <w:szCs w:val="22"/>
+        </w:rPr>
+        <w:t xml:space="preserve">Give it three consistent weeks before judging. Then check:</w:t>
+      </w:r>
+    </w:p>
+    <w:p>
+      <w:pPr>
+        <w:spacing w:after="160" w:before="0"/>
+      </w:pPr>
+      <w:r>
+        <w:rPr>
+          <w:rFonts w:ascii="Calibri" w:cs="Calibri" w:eastAsia="Calibri" w:hAnsi="Calibri"/>
+          <w:b/>
+          <w:bCs/>
+          <w:color w:val="333333"/>
+          <w:sz w:val="22"/>
+          <w:szCs w:val="22"/>
+        </w:rPr>
+        <w:t xml:space="preserve">For strength (1–5 reps): </w:t>
+      </w:r>
+      <w:r>
+        <w:rPr>
+          <w:rFonts w:ascii="Calibri" w:cs="Calibri" w:eastAsia="Calibri" w:hAnsi="Calibri"/>
+          <w:color w:val="333333"/>
+          <w:sz w:val="22"/>
+          <w:szCs w:val="22"/>
+        </w:rPr>
+        <w:t xml:space="preserve">Is the weight on your main lifts moving up every week or two? If yes, the range is working.</w:t>
+      </w:r>
+    </w:p>
+    <w:p>
+      <w:pPr>
+        <w:spacing w:after="160" w:before="0"/>
+      </w:pPr>
+      <w:r>
+        <w:rPr>
+          <w:rFonts w:ascii="Calibri" w:cs="Calibri" w:eastAsia="Calibri" w:hAnsi="Calibri"/>
+          <w:b/>
+          <w:bCs/>
+          <w:color w:val="333333"/>
+          <w:sz w:val="22"/>
+          <w:szCs w:val="22"/>
+        </w:rPr>
+        <w:t xml:space="preserve">For muscle growth (8–10 reps): </w:t>
+      </w:r>
+      <w:r>
+        <w:rPr>
+          <w:rFonts w:ascii="Calibri" w:cs="Calibri" w:eastAsia="Calibri" w:hAnsi="Calibri"/>
+          <w:color w:val="333333"/>
+          <w:sz w:val="22"/>
+          <w:szCs w:val="22"/>
+        </w:rPr>
+        <w:t xml:space="preserve">Are the last 2 reps still hard? Are you increasing weight to stay challenged at 10? Both mean the muscle is adapting.</w:t>
+      </w:r>
+    </w:p>
+    <w:p>
+      <w:pPr>
+        <w:spacing w:after="160" w:before="0"/>
+      </w:pPr>
+      <w:r>
+        <w:rPr>
+          <w:rFonts w:ascii="Calibri" w:cs="Calibri" w:eastAsia="Calibri" w:hAnsi="Calibri"/>
+          <w:b/>
+          <w:bCs/>
+          <w:color w:val="333333"/>
+          <w:sz w:val="22"/>
+          <w:szCs w:val="22"/>
+        </w:rPr>
+        <w:t xml:space="preserve">For endurance (15–20 reps): </w:t>
+      </w:r>
+      <w:r>
+        <w:rPr>
+          <w:rFonts w:ascii="Calibri" w:cs="Calibri" w:eastAsia="Calibri" w:hAnsi="Calibri"/>
+          <w:color w:val="333333"/>
+          <w:sz w:val="22"/>
+          <w:szCs w:val="22"/>
+        </w:rPr>
+        <w:t xml:space="preserve">More reps at the same weight than three weeks ago? That’s endurance improving.</w:t>
+      </w:r>
+    </w:p>
+    <w:p>
+      <w:pPr>
+        <w:spacing w:after="240" w:before="0"/>
+      </w:pPr>
+      <w:r>
+        <w:rPr>
+          <w:rFonts w:ascii="Calibri" w:cs="Calibri" w:eastAsia="Calibri" w:hAnsi="Calibri"/>
+          <w:color w:val="333333"/>
+          <w:sz w:val="22"/>
+          <w:szCs w:val="22"/>
+        </w:rPr>
+        <w:t xml:space="preserve">If nothing’s changing, the issue is almost always load — not the range. Go heavier until the final reps require real effort.</w:t>
+      </w:r>
+    </w:p>
+    <w:p>
+      <w:pPr>
+        <w:pStyle w:val="Heading2"/>
+        <w:spacing w:after="160" w:before="360"/>
+      </w:pPr>
+      <w:r>
+        <w:rPr>
+          <w:rFonts w:ascii="Calibri" w:cs="Calibri" w:eastAsia="Calibri" w:hAnsi="Calibri"/>
+          <w:b/>
+          <w:bCs/>
+          <w:color w:val="2c2c2c"/>
+          <w:sz w:val="28"/>
+          <w:szCs w:val="28"/>
+        </w:rPr>
         <w:t xml:space="preserve">FAQ</w:t>
       </w:r>
     </w:p>
@@ -1122,21 +1118,21 @@
           <w:sz w:val="22"/>
           <w:szCs w:val="22"/>
         </w:rPr>
-        <w:t xml:space="preserve">Does rep range matter if I'm a total beginner?</w:t>
-      </w:r>
-    </w:p>
-    <w:p>
-      <w:pPr>
-        <w:spacing w:after="160" w:before="0"/>
-      </w:pPr>
-      <w:r>
-        <w:rPr>
-          <w:rFonts w:ascii="Calibri" w:cs="Calibri" w:eastAsia="Calibri" w:hAnsi="Calibri"/>
-          <w:color w:val="333333"/>
-          <w:sz w:val="22"/>
-          <w:szCs w:val="22"/>
-        </w:rPr>
-        <w:t xml:space="preserve">Yes. Beginners adapt fast — which means training in the right range from the start produces visible results within weeks, not months. The wrong range wastes that early adaptation window.</w:t>
+        <w:t xml:space="preserve">Does rep range matter for total beginners?</w:t>
+      </w:r>
+    </w:p>
+    <w:p>
+      <w:pPr>
+        <w:spacing w:after="160" w:before="0"/>
+      </w:pPr>
+      <w:r>
+        <w:rPr>
+          <w:rFonts w:ascii="Calibri" w:cs="Calibri" w:eastAsia="Calibri" w:hAnsi="Calibri"/>
+          <w:color w:val="333333"/>
+          <w:sz w:val="22"/>
+          <w:szCs w:val="22"/>
+        </w:rPr>
+        <w:t xml:space="preserve">Yes. Beginners adapt faster than any other group. The right range from day one means visible results in weeks, not months.</w:t>
       </w:r>
     </w:p>
     <w:p>
@@ -1152,21 +1148,21 @@
           <w:sz w:val="22"/>
           <w:szCs w:val="22"/>
         </w:rPr>
-        <w:t xml:space="preserve">Can I use different rep ranges for different exercises in the same workout?</w:t>
-      </w:r>
-    </w:p>
-    <w:p>
-      <w:pPr>
-        <w:spacing w:after="160" w:before="0"/>
-      </w:pPr>
-      <w:r>
-        <w:rPr>
-          <w:rFonts w:ascii="Calibri" w:cs="Calibri" w:eastAsia="Calibri" w:hAnsi="Calibri"/>
-          <w:color w:val="333333"/>
-          <w:sz w:val="22"/>
-          <w:szCs w:val="22"/>
-        </w:rPr>
-        <w:t xml:space="preserve">Yes, and most intermediate programs do exactly this. Heavy squats at 5 reps followed by leg curls at 12 reps is a common and effective setup. But if you're new, stick with one rep range per workout until you understand how your body responds to each.</w:t>
+        <w:t xml:space="preserve">Can I use multiple rep ranges in one workout?</w:t>
+      </w:r>
+    </w:p>
+    <w:p>
+      <w:pPr>
+        <w:spacing w:after="160" w:before="0"/>
+      </w:pPr>
+      <w:r>
+        <w:rPr>
+          <w:rFonts w:ascii="Calibri" w:cs="Calibri" w:eastAsia="Calibri" w:hAnsi="Calibri"/>
+          <w:color w:val="333333"/>
+          <w:sz w:val="22"/>
+          <w:szCs w:val="22"/>
+        </w:rPr>
+        <w:t xml:space="preserve">Yes — heavy squats at 5 reps followed by leg extensions at 12 is common and effective. But master one range first before mixing.</w:t>
       </w:r>
     </w:p>
     <w:p>
@@ -1182,21 +1178,21 @@
           <w:sz w:val="22"/>
           <w:szCs w:val="22"/>
         </w:rPr>
-        <w:t xml:space="preserve">What if I want both strength AND size?</w:t>
-      </w:r>
-    </w:p>
-    <w:p>
-      <w:pPr>
-        <w:spacing w:after="160" w:before="0"/>
-      </w:pPr>
-      <w:r>
-        <w:rPr>
-          <w:rFonts w:ascii="Calibri" w:cs="Calibri" w:eastAsia="Calibri" w:hAnsi="Calibri"/>
-          <w:color w:val="333333"/>
-          <w:sz w:val="22"/>
-          <w:szCs w:val="22"/>
-        </w:rPr>
-        <w:t xml:space="preserve">Alternate between the two ranges across your training week. Heavy compound work (3–5 reps) on two days, moderate hypertrophy work (8–10 reps) on two days. This is called daily undulating periodization and it works — but it adds complexity. Get comfortable with one range first.</w:t>
+        <w:t xml:space="preserve">What if I want both strength and size?</w:t>
+      </w:r>
+    </w:p>
+    <w:p>
+      <w:pPr>
+        <w:spacing w:after="160" w:before="0"/>
+      </w:pPr>
+      <w:r>
+        <w:rPr>
+          <w:rFonts w:ascii="Calibri" w:cs="Calibri" w:eastAsia="Calibri" w:hAnsi="Calibri"/>
+          <w:color w:val="333333"/>
+          <w:sz w:val="22"/>
+          <w:szCs w:val="22"/>
+        </w:rPr>
+        <w:t xml:space="preserve">Heavy compounds (3–5 reps) two days, hypertrophy work (8–10 reps) two days. Works well but adds complexity — get comfortable with one approach first.</w:t>
       </w:r>
     </w:p>
     <w:p>
@@ -1212,21 +1208,21 @@
           <w:sz w:val="22"/>
           <w:szCs w:val="22"/>
         </w:rPr>
-        <w:t xml:space="preserve">Will I get bulky training in the 1–5 rep range?</w:t>
-      </w:r>
-    </w:p>
-    <w:p>
-      <w:pPr>
-        <w:spacing w:after="160" w:before="0"/>
-      </w:pPr>
-      <w:r>
-        <w:rPr>
-          <w:rFonts w:ascii="Calibri" w:cs="Calibri" w:eastAsia="Calibri" w:hAnsi="Calibri"/>
-          <w:color w:val="333333"/>
-          <w:sz w:val="22"/>
-          <w:szCs w:val="22"/>
-        </w:rPr>
-        <w:t xml:space="preserve">No. Low-rep, heavy training builds strength and neural efficiency. Muscle size comes primarily from the 6–12 range with adequate volume and calories. Strength training alone won't make you bulky.</w:t>
+        <w:t xml:space="preserve">Will low-rep heavy training make me bulky?</w:t>
+      </w:r>
+    </w:p>
+    <w:p>
+      <w:pPr>
+        <w:spacing w:after="160" w:before="0"/>
+      </w:pPr>
+      <w:r>
+        <w:rPr>
+          <w:rFonts w:ascii="Calibri" w:cs="Calibri" w:eastAsia="Calibri" w:hAnsi="Calibri"/>
+          <w:color w:val="333333"/>
+          <w:sz w:val="22"/>
+          <w:szCs w:val="22"/>
+        </w:rPr>
+        <w:t xml:space="preserve">No. Low reps build strength and neural efficiency. Visible size comes from the 6–12 range with enough volume and calories.</w:t>
       </w:r>
     </w:p>
     <w:p>
@@ -1242,21 +1238,21 @@
           <w:sz w:val="22"/>
           <w:szCs w:val="22"/>
         </w:rPr>
-        <w:t xml:space="preserve">How long should I stay in one rep range before switching?</w:t>
-      </w:r>
-    </w:p>
-    <w:p>
-      <w:pPr>
-        <w:spacing w:after="160" w:before="0"/>
-      </w:pPr>
-      <w:r>
-        <w:rPr>
-          <w:rFonts w:ascii="Calibri" w:cs="Calibri" w:eastAsia="Calibri" w:hAnsi="Calibri"/>
-          <w:color w:val="333333"/>
-          <w:sz w:val="22"/>
-          <w:szCs w:val="22"/>
-        </w:rPr>
-        <w:t xml:space="preserve">Minimum 6 weeks. Adaptation takes time. Switching every session or every week means your body never fully adapts to any single stimulus — and you stay stuck in the same place the title of this article warned you about.</w:t>
+        <w:t xml:space="preserve">How long should I stay in one rep range?</w:t>
+      </w:r>
+    </w:p>
+    <w:p>
+      <w:pPr>
+        <w:spacing w:after="160" w:before="0"/>
+      </w:pPr>
+      <w:r>
+        <w:rPr>
+          <w:rFonts w:ascii="Calibri" w:cs="Calibri" w:eastAsia="Calibri" w:hAnsi="Calibri"/>
+          <w:color w:val="333333"/>
+          <w:sz w:val="22"/>
+          <w:szCs w:val="22"/>
+        </w:rPr>
+        <w:t xml:space="preserve">Minimum 6 weeks. Changing every week means your body never fully adapts to any single stimulus.</w:t>
       </w:r>
     </w:p>
     <w:sectPr>

</xml_diff>